<commit_message>
fix: refresh preview cache and report template
</commit_message>
<xml_diff>
--- a/app/static/report-templates/daily-report-template.docx
+++ b/app/static/report-templates/daily-report-template.docx
@@ -810,7 +810,7 @@
             </w:pPr>
             <w:r>
               <w:rPr>
-                <w:rFonts w:ascii="微软雅黑" w:eastAsia="微软雅黑" w:hAnsi="微软雅黑" w:cs="宋体"/>
+                <w:rFonts w:ascii="微软雅黑" w:eastAsia="微软雅黑" w:hAnsi="微软雅黑" w:cs="微软雅黑"/>
                 <w:snapToGrid/>
               </w:rPr>
               <w:t>{{ waf_detail }}</w:t>
@@ -939,7 +939,7 @@
             </w:pPr>
             <w:r>
               <w:rPr>
-                <w:rFonts w:ascii="宋体" w:hAnsi="宋体" w:cs="宋体" w:hint="eastAsia"/>
+                <w:rFonts w:ascii="宋体" w:hAnsi="宋体" w:cs="宋体" w:hint="eastAsia" w:eastAsia="宋体"/>
                 <w:snapToGrid/>
               </w:rPr>
               <w:t>图1： WAF监测攻击情况（单位：次）</w:t>
@@ -969,7 +969,7 @@
             </w:r>
             <w:r>
               <w:rPr>
-                <w:rFonts w:ascii="微软雅黑" w:eastAsia="微软雅黑" w:hAnsi="微软雅黑" w:cs="宋体"/>
+                <w:rFonts w:ascii="微软雅黑" w:eastAsia="微软雅黑" w:hAnsi="微软雅黑" w:cs="微软雅黑"/>
                 <w:snapToGrid/>
               </w:rPr>
               <w:t>{{ waf_qps_detail }}</w:t>
@@ -1109,7 +1109,7 @@
             </w:r>
             <w:r>
               <w:rPr>
-                <w:rFonts w:ascii="宋体" w:hAnsi="宋体" w:cs="宋体" w:hint="eastAsia"/>
+                <w:rFonts w:ascii="宋体" w:hAnsi="宋体" w:cs="宋体" w:hint="eastAsia" w:eastAsia="宋体"/>
                 <w:snapToGrid/>
               </w:rPr>
               <w:t>图2： WAF监测QPS趋势情况（单位：qps）</w:t>
@@ -1131,7 +1131,7 @@
             </w:pPr>
             <w:r>
               <w:rPr>
-                <w:rFonts w:ascii="微软雅黑" w:eastAsia="微软雅黑" w:hAnsi="微软雅黑" w:cs="宋体"/>
+                <w:rFonts w:ascii="宋体" w:eastAsia="宋体" w:hAnsi="宋体" w:cs="宋体"/>
                 <w:snapToGrid/>
               </w:rPr>
               <w:t>{{ cfw_detail }}</w:t>
@@ -1244,21 +1244,21 @@
             </w:pPr>
             <w:r>
               <w:rPr>
+                <w:rFonts w:ascii="宋体" w:hAnsi="宋体" w:cs="宋体" w:hint="eastAsia" w:eastAsia="宋体"/>
+                <w:snapToGrid/>
+              </w:rPr>
+              <w:t>图3：</w:t>
+            </w:r>
+            <w:r>
+              <w:rPr>
                 <w:rFonts w:ascii="宋体" w:hAnsi="宋体" w:cs="宋体" w:hint="eastAsia"/>
                 <w:snapToGrid/>
               </w:rPr>
-              <w:t>图3：</w:t>
-            </w:r>
-            <w:r>
-              <w:rPr>
-                <w:rFonts w:ascii="宋体" w:hAnsi="宋体" w:cs="宋体" w:hint="eastAsia"/>
-                <w:snapToGrid/>
-              </w:rPr>
               <w:t xml:space="preserve">  </w:t>
             </w:r>
             <w:r>
               <w:rPr>
-                <w:rFonts w:ascii="宋体" w:hAnsi="宋体" w:cs="宋体" w:hint="eastAsia"/>
+                <w:rFonts w:ascii="宋体" w:hAnsi="宋体" w:cs="宋体" w:hint="eastAsia" w:eastAsia="宋体"/>
                 <w:snapToGrid/>
               </w:rPr>
               <w:t>CFW监测攻击情况（单位：次）</w:t>
@@ -1280,7 +1280,7 @@
             </w:pPr>
             <w:r>
               <w:rPr>
-                <w:rFonts w:ascii="微软雅黑" w:eastAsia="微软雅黑" w:hAnsi="微软雅黑" w:cs="宋体" w:hint="eastAsia"/>
+                <w:rFonts w:ascii="宋体" w:eastAsia="宋体" w:hAnsi="宋体" w:cs="宋体" w:hint="eastAsia"/>
                 <w:snapToGrid/>
               </w:rPr>
               <w:t>当前CFW产品互联网边界防护带宽为{{ cfw_bandwidth_spec }}。监测到带宽峰值时间段为{{ cfw_peak_inbound_range }}，入方向流量峰值{{ cfw_inbound_peak_display }}Gbps，入方向95带宽值{{ cfw_inbound_95th_display }}Gbps。{{ cfw_exceeded_text }}</w:t>
@@ -1479,21 +1479,21 @@
             </w:pPr>
             <w:r>
               <w:rPr>
+                <w:rFonts w:ascii="宋体" w:hAnsi="宋体" w:cs="宋体" w:hint="eastAsia" w:eastAsia="宋体"/>
+                <w:snapToGrid/>
+              </w:rPr>
+              <w:t>图4：</w:t>
+            </w:r>
+            <w:r>
+              <w:rPr>
                 <w:rFonts w:ascii="宋体" w:hAnsi="宋体" w:cs="宋体" w:hint="eastAsia"/>
                 <w:snapToGrid/>
               </w:rPr>
-              <w:t>图4：</w:t>
-            </w:r>
-            <w:r>
-              <w:rPr>
-                <w:rFonts w:ascii="宋体" w:hAnsi="宋体" w:cs="宋体" w:hint="eastAsia"/>
-                <w:snapToGrid/>
-              </w:rPr>
               <w:t xml:space="preserve">  </w:t>
             </w:r>
             <w:r>
               <w:rPr>
-                <w:rFonts w:ascii="宋体" w:hAnsi="宋体" w:cs="宋体" w:hint="eastAsia"/>
+                <w:rFonts w:ascii="宋体" w:hAnsi="宋体" w:cs="宋体" w:hint="eastAsia" w:eastAsia="宋体"/>
                 <w:snapToGrid/>
               </w:rPr>
               <w:t>CFW监测带宽情况（单位：Mbps）</w:t>
@@ -1514,7 +1514,7 @@
             </w:pPr>
             <w:r>
               <w:rPr>
-                <w:rFonts w:ascii="微软雅黑" w:eastAsia="微软雅黑" w:hAnsi="微软雅黑" w:cs="宋体" w:hint="eastAsia"/>
+                <w:rFonts w:ascii="宋体" w:eastAsia="宋体" w:hAnsi="宋体" w:cs="宋体" w:hint="eastAsia"/>
                 <w:snapToGrid/>
               </w:rPr>
               <w:t>{{ hss_detail }}</w:t>
@@ -1679,7 +1679,7 @@
             </w:pPr>
             <w:r>
               <w:rPr>
-                <w:rFonts w:ascii="宋体" w:hAnsi="宋体" w:cs="宋体" w:hint="eastAsia"/>
+                <w:rFonts w:ascii="宋体" w:hAnsi="宋体" w:cs="宋体" w:hint="eastAsia" w:eastAsia="宋体"/>
                 <w:snapToGrid/>
               </w:rPr>
               <w:t>图5： HSS监测攻击情况（单位：次）</w:t>
@@ -1709,7 +1709,7 @@
             </w:r>
             <w:r>
               <w:rPr>
-                <w:rFonts w:ascii="微软雅黑" w:eastAsia="微软雅黑" w:hAnsi="微软雅黑" w:cs="宋体" w:hint="eastAsia"/>
+                <w:rFonts w:ascii="宋体" w:eastAsia="宋体" w:hAnsi="宋体" w:cs="宋体" w:hint="eastAsia"/>
                 <w:snapToGrid/>
               </w:rPr>
               <w:t>{{ ddos_detail }}</w:t>
@@ -1798,7 +1798,7 @@
             </w:pPr>
             <w:r>
               <w:rPr>
-                <w:rFonts w:ascii="宋体" w:hAnsi="宋体" w:cs="宋体" w:hint="eastAsia"/>
+                <w:rFonts w:ascii="宋体" w:hAnsi="宋体" w:cs="宋体" w:hint="eastAsia" w:eastAsia="宋体"/>
                 <w:snapToGrid/>
               </w:rPr>
               <w:t>图6： DDos防护情况（单位：次）</w:t>
@@ -1826,7 +1826,7 @@
             </w:r>
             <w:r>
               <w:rPr>
-                <w:rFonts w:ascii="微软雅黑" w:eastAsia="微软雅黑" w:hAnsi="微软雅黑" w:cs="宋体"/>
+                <w:rFonts w:ascii="宋体" w:eastAsia="宋体" w:hAnsi="宋体" w:cs="宋体"/>
                 <w:snapToGrid/>
               </w:rPr>
               <w:t>{{ secmaster_detail }}</w:t>
@@ -1994,42 +1994,42 @@
             </w:pPr>
             <w:r>
               <w:rPr>
+                <w:rFonts w:ascii="宋体" w:hAnsi="宋体" w:cs="宋体" w:hint="eastAsia" w:eastAsia="宋体"/>
+                <w:snapToGrid/>
+              </w:rPr>
+              <w:t>图7</w:t>
+            </w:r>
+            <w:r>
+              <w:rPr>
+                <w:rFonts w:ascii="宋体" w:hAnsi="宋体" w:cs="宋体" w:hint="eastAsia" w:eastAsia="宋体"/>
+                <w:snapToGrid/>
+              </w:rPr>
+              <w:t>：</w:t>
+            </w:r>
+            <w:r>
+              <w:rPr>
                 <w:rFonts w:ascii="宋体" w:hAnsi="宋体" w:cs="宋体" w:hint="eastAsia"/>
                 <w:snapToGrid/>
               </w:rPr>
-              <w:t>图7</w:t>
+              <w:t xml:space="preserve"> </w:t>
             </w:r>
             <w:r>
               <w:rPr>
                 <w:rFonts w:ascii="宋体" w:hAnsi="宋体" w:cs="宋体" w:hint="eastAsia"/>
                 <w:snapToGrid/>
               </w:rPr>
-              <w:t>：</w:t>
-            </w:r>
-            <w:r>
-              <w:rPr>
-                <w:rFonts w:ascii="宋体" w:hAnsi="宋体" w:cs="宋体" w:hint="eastAsia"/>
-                <w:snapToGrid/>
-              </w:rPr>
               <w:t xml:space="preserve"> </w:t>
             </w:r>
             <w:r>
               <w:rPr>
-                <w:rFonts w:ascii="宋体" w:hAnsi="宋体" w:cs="宋体" w:hint="eastAsia"/>
-                <w:snapToGrid/>
-              </w:rPr>
-              <w:t xml:space="preserve"> </w:t>
-            </w:r>
-            <w:r>
-              <w:rPr>
-                <w:rFonts w:ascii="宋体" w:hAnsi="宋体" w:cs="宋体"/>
+                <w:rFonts w:ascii="宋体" w:hAnsi="宋体" w:cs="宋体" w:eastAsia="宋体"/>
                 <w:snapToGrid/>
               </w:rPr>
               <w:t>SecMaster</w:t>
             </w:r>
             <w:r>
               <w:rPr>
-                <w:rFonts w:ascii="宋体" w:hAnsi="宋体" w:cs="宋体" w:hint="eastAsia"/>
+                <w:rFonts w:ascii="宋体" w:hAnsi="宋体" w:cs="宋体" w:hint="eastAsia" w:eastAsia="宋体"/>
                 <w:snapToGrid/>
               </w:rPr>
               <w:t>检测攻击情况</w:t>
@@ -2053,7 +2053,7 @@
             </w:pPr>
             <w:r>
               <w:rPr>
-                <w:rFonts w:ascii="宋体" w:hAnsi="宋体" w:cs="宋体" w:hint="eastAsia"/>
+                <w:rFonts w:ascii="宋体" w:hAnsi="宋体" w:cs="宋体" w:hint="eastAsia" w:eastAsia="宋体"/>
                 <w:snapToGrid/>
                 <w:sz w:val="24"/>
                 <w:szCs w:val="24"/>
@@ -2070,7 +2070,7 @@
             </w:r>
             <w:r>
               <w:rPr>
-                <w:rFonts w:ascii="微软雅黑" w:eastAsia="微软雅黑" w:hAnsi="微软雅黑" w:cs="宋体" w:hint="eastAsia"/>
+                <w:rFonts w:ascii="宋体" w:eastAsia="宋体" w:hAnsi="宋体" w:cs="宋体" w:hint="eastAsia"/>
                 <w:b/>
                 <w:bCs/>
                 <w:snapToGrid/>
@@ -2095,9 +2095,27 @@
                 <w:szCs w:val="24"/>
               </w:rPr>
             </w:pPr>
-            <w:r>
-              <w:rPr>
-                <w:rFonts w:ascii="微软雅黑" w:eastAsia="微软雅黑" w:hAnsi="微软雅黑" w:cs="宋体" w:hint="eastAsia"/>
+          </w:p>
+          <w:p>
+            <w:pPr>
+              <w:widowControl/>
+              <w:shd w:val="clear" w:color="auto" w:fill="FFFFFF"/>
+              <w:autoSpaceDE/>
+              <w:autoSpaceDN/>
+              <w:adjustRightInd/>
+              <w:spacing w:line="360" w:lineRule="atLeast"/>
+              <w:ind w:left="360"/>
+              <w:jc w:val="both"/>
+              <w:rPr>
+                <w:rFonts w:ascii="宋体" w:hAnsi="宋体" w:cs="宋体" w:hint="eastAsia"/>
+                <w:snapToGrid/>
+                <w:sz w:val="24"/>
+                <w:szCs w:val="24"/>
+              </w:rPr>
+            </w:pPr>
+            <w:r>
+              <w:rPr>
+                <w:rFonts w:ascii="微软雅黑" w:eastAsia="微软雅黑" w:hAnsi="微软雅黑" w:cs="微软雅黑" w:hint="eastAsia"/>
                 <w:snapToGrid/>
                 <w:color w:val="000000"/>
               </w:rPr>

</xml_diff>

<commit_message>
fix: separate qps caption and stretch header banner
</commit_message>
<xml_diff>
--- a/app/static/report-templates/daily-report-template.docx
+++ b/app/static/report-templates/daily-report-template.docx
@@ -71,7 +71,7 @@
                   <wp:positionV relativeFrom="paragraph">
                     <wp:posOffset>0</wp:posOffset>
                   </wp:positionV>
-                  <wp:extent cx="6176010" cy="1118235"/>
+                  <wp:extent cx="6645910" cy="1118235"/>
                   <wp:effectExtent l="0" t="0" r="0" b="0"/>
                   <wp:wrapNone/>
                   <wp:docPr id="23" name="图片 23"/>
@@ -90,7 +90,7 @@
                         <pic:blipFill>
                           <a:blip r:embed="rId8">
                             <a:extLst>
-                              <a:ext uri="{28A0092B-C50C-407E-A947-70E740481C1C}">
+                              <a:ext uri="{28A0092B-C50C-407E-A947-70E740481C1C}" cx="6645910" cy="1118235">
                                 <a14:useLocalDpi xmlns:a14="http://schemas.microsoft.com/office/drawing/2010/main" val="0"/>
                               </a:ext>
                             </a:extLst>
@@ -102,7 +102,7 @@
                         <pic:spPr>
                           <a:xfrm>
                             <a:off x="0" y="0"/>
-                            <a:ext cx="6176010" cy="1118235"/>
+                            <a:ext cx="6645910" cy="1118235"/>
                           </a:xfrm>
                           <a:prstGeom prst="rect">
                             <a:avLst/>
@@ -1107,6 +1107,22 @@
                 </wp:inline>
               </w:drawing>
             </w:r>
+          </w:p>
+          <w:p>
+            <w:pPr>
+              <w:widowControl/>
+              <w:autoSpaceDE/>
+              <w:autoSpaceDN/>
+              <w:adjustRightInd/>
+              <w:spacing w:line="252" w:lineRule="atLeast"/>
+              <w:jc w:val="center"/>
+              <w:rPr>
+                <w:rFonts w:ascii="宋体" w:hAnsi="宋体" w:cs="宋体" w:hint="eastAsia"/>
+                <w:snapToGrid/>
+                <w:sz w:val="24"/>
+                <w:szCs w:val="24"/>
+              </w:rPr>
+            </w:pPr>
             <w:r>
               <w:rPr>
                 <w:rFonts w:ascii="宋体" w:hAnsi="宋体" w:cs="宋体" w:hint="eastAsia" w:eastAsia="宋体"/>
@@ -1131,7 +1147,7 @@
             </w:pPr>
             <w:r>
               <w:rPr>
-                <w:rFonts w:ascii="宋体" w:eastAsia="宋体" w:hAnsi="宋体" w:cs="宋体"/>
+                <w:rFonts w:ascii="微软雅黑" w:eastAsia="微软雅黑" w:hAnsi="微软雅黑" w:cs="微软雅黑"/>
                 <w:snapToGrid/>
               </w:rPr>
               <w:t>{{ cfw_detail }}</w:t>
@@ -1280,7 +1296,7 @@
             </w:pPr>
             <w:r>
               <w:rPr>
-                <w:rFonts w:ascii="宋体" w:eastAsia="宋体" w:hAnsi="宋体" w:cs="宋体" w:hint="eastAsia"/>
+                <w:rFonts w:ascii="微软雅黑" w:eastAsia="微软雅黑" w:hAnsi="微软雅黑" w:cs="微软雅黑" w:hint="eastAsia"/>
                 <w:snapToGrid/>
               </w:rPr>
               <w:t>当前CFW产品互联网边界防护带宽为{{ cfw_bandwidth_spec }}。监测到带宽峰值时间段为{{ cfw_peak_inbound_range }}，入方向流量峰值{{ cfw_inbound_peak_display }}Gbps，入方向95带宽值{{ cfw_inbound_95th_display }}Gbps。{{ cfw_exceeded_text }}</w:t>
@@ -1514,7 +1530,7 @@
             </w:pPr>
             <w:r>
               <w:rPr>
-                <w:rFonts w:ascii="宋体" w:eastAsia="宋体" w:hAnsi="宋体" w:cs="宋体" w:hint="eastAsia"/>
+                <w:rFonts w:ascii="微软雅黑" w:eastAsia="微软雅黑" w:hAnsi="微软雅黑" w:cs="微软雅黑" w:hint="eastAsia"/>
                 <w:snapToGrid/>
               </w:rPr>
               <w:t>{{ hss_detail }}</w:t>
@@ -1709,7 +1725,7 @@
             </w:r>
             <w:r>
               <w:rPr>
-                <w:rFonts w:ascii="宋体" w:eastAsia="宋体" w:hAnsi="宋体" w:cs="宋体" w:hint="eastAsia"/>
+                <w:rFonts w:ascii="微软雅黑" w:eastAsia="微软雅黑" w:hAnsi="微软雅黑" w:cs="微软雅黑" w:hint="eastAsia"/>
                 <w:snapToGrid/>
               </w:rPr>
               <w:t>{{ ddos_detail }}</w:t>
@@ -1826,7 +1842,7 @@
             </w:r>
             <w:r>
               <w:rPr>
-                <w:rFonts w:ascii="宋体" w:eastAsia="宋体" w:hAnsi="宋体" w:cs="宋体"/>
+                <w:rFonts w:ascii="微软雅黑" w:eastAsia="微软雅黑" w:hAnsi="微软雅黑" w:cs="微软雅黑"/>
                 <w:snapToGrid/>
               </w:rPr>
               <w:t>{{ secmaster_detail }}</w:t>
@@ -2077,24 +2093,6 @@
               </w:rPr>
               <w:t>{{ emergency_heading }}</w:t>
             </w:r>
-          </w:p>
-          <w:p>
-            <w:pPr>
-              <w:widowControl/>
-              <w:shd w:val="clear" w:color="auto" w:fill="FFFFFF"/>
-              <w:autoSpaceDE/>
-              <w:autoSpaceDN/>
-              <w:adjustRightInd/>
-              <w:spacing w:line="360" w:lineRule="atLeast"/>
-              <w:ind w:left="360"/>
-              <w:jc w:val="both"/>
-              <w:rPr>
-                <w:rFonts w:ascii="宋体" w:hAnsi="宋体" w:cs="宋体" w:hint="eastAsia"/>
-                <w:snapToGrid/>
-                <w:sz w:val="24"/>
-                <w:szCs w:val="24"/>
-              </w:rPr>
-            </w:pPr>
           </w:p>
           <w:p>
             <w:pPr>

</xml_diff>

<commit_message>
fix: improve operators page layout
</commit_message>
<xml_diff>
--- a/app/static/report-templates/daily-report-template.docx
+++ b/app/static/report-templates/daily-report-template.docx
@@ -1208,7 +1208,7 @@
               <w:lastRenderedPageBreak/>
               <w:drawing>
                 <wp:inline distT="0" distB="0" distL="0" distR="0" wp14:anchorId="56F6530A" wp14:editId="42DC7E26">
-                  <wp:extent cx="6645910" cy="3443605"/>
+                  <wp:extent cx="6300000" cy="3264370"/>
                   <wp:effectExtent l="0" t="0" r="2540" b="4445"/>
                   <wp:docPr id="1421749175" name="图片 1"/>
                   <wp:cNvGraphicFramePr>
@@ -1230,7 +1230,7 @@
                         <pic:spPr>
                           <a:xfrm>
                             <a:off x="0" y="0"/>
-                            <a:ext cx="6645910" cy="3443605"/>
+                            <a:ext cx="6300000" cy="3264370"/>
                           </a:xfrm>
                           <a:prstGeom prst="rect">
                             <a:avLst/>
@@ -2671,7 +2671,7 @@
             </w:tr>
             <w:tr>
               <w:trPr>
-                <w:trHeight w:val="370"/>
+                <w:trHeight w:val="380"/>
               </w:trPr>
               <w:tc>
                 <w:tcPr>
@@ -2899,7 +2899,7 @@
             </w:tr>
             <w:tr>
               <w:trPr>
-                <w:trHeight w:val="370"/>
+                <w:trHeight w:val="380"/>
               </w:trPr>
               <w:tc>
                 <w:tcPr>
@@ -3289,7 +3289,7 @@
             </w:tr>
             <w:tr>
               <w:trPr>
-                <w:trHeight w:val="312"/>
+                <w:trHeight w:val="380"/>
               </w:trPr>
               <w:tc>
                 <w:tcPr>

</xml_diff>

<commit_message>
fix: align report footer date and operator rows
</commit_message>
<xml_diff>
--- a/app/static/report-templates/daily-report-template.docx
+++ b/app/static/report-templates/daily-report-template.docx
@@ -2671,7 +2671,7 @@
             </w:tr>
             <w:tr>
               <w:trPr>
-                <w:trHeight w:val="380"/>
+                <w:trHeight w:val="380" w:hRule="exact"/>
               </w:trPr>
               <w:tc>
                 <w:tcPr>
@@ -2899,7 +2899,7 @@
             </w:tr>
             <w:tr>
               <w:trPr>
-                <w:trHeight w:val="380"/>
+                <w:trHeight w:val="380" w:hRule="exact"/>
               </w:trPr>
               <w:tc>
                 <w:tcPr>
@@ -3087,7 +3087,7 @@
             </w:tr>
             <w:tr>
               <w:trPr>
-                <w:trHeight w:val="380"/>
+                <w:trHeight w:val="380" w:hRule="exact"/>
               </w:trPr>
               <w:tc>
                 <w:tcPr>
@@ -3289,7 +3289,7 @@
             </w:tr>
             <w:tr>
               <w:trPr>
-                <w:trHeight w:val="380"/>
+                <w:trHeight w:val="380" w:hRule="exact"/>
               </w:trPr>
               <w:tc>
                 <w:tcPr>
@@ -3643,22 +3643,10 @@
             <w:pStyle w:val="a7"/>
           </w:pPr>
           <w:r>
-            <w:fldChar w:fldCharType="begin"/>
-          </w:r>
-          <w:r>
-            <w:instrText xml:space="preserve"> TIME \@ "yyyy-M-d" </w:instrText>
-          </w:r>
-          <w:r>
-            <w:fldChar w:fldCharType="separate"/>
-          </w:r>
-          <w:r>
             <w:rPr>
               <w:noProof/>
             </w:rPr>
-            <w:t>2026-6-24</w:t>
-          </w:r>
-          <w:r>
-            <w:fldChar w:fldCharType="end"/>
+            <w:t>{{ report_date }}</w:t>
           </w:r>
         </w:p>
       </w:tc>

</xml_diff>

<commit_message>
fix: increase operator table row height
</commit_message>
<xml_diff>
--- a/app/static/report-templates/daily-report-template.docx
+++ b/app/static/report-templates/daily-report-template.docx
@@ -2671,7 +2671,7 @@
             </w:tr>
             <w:tr>
               <w:trPr>
-                <w:trHeight w:val="380" w:hRule="exact"/>
+                <w:trHeight w:val="440" w:hRule="exact"/>
               </w:trPr>
               <w:tc>
                 <w:tcPr>
@@ -2899,7 +2899,7 @@
             </w:tr>
             <w:tr>
               <w:trPr>
-                <w:trHeight w:val="380" w:hRule="exact"/>
+                <w:trHeight w:val="440" w:hRule="exact"/>
               </w:trPr>
               <w:tc>
                 <w:tcPr>
@@ -3087,7 +3087,7 @@
             </w:tr>
             <w:tr>
               <w:trPr>
-                <w:trHeight w:val="380" w:hRule="exact"/>
+                <w:trHeight w:val="440" w:hRule="exact"/>
               </w:trPr>
               <w:tc>
                 <w:tcPr>
@@ -3289,7 +3289,7 @@
             </w:tr>
             <w:tr>
               <w:trPr>
-                <w:trHeight w:val="380" w:hRule="exact"/>
+                <w:trHeight w:val="440" w:hRule="exact"/>
               </w:trPr>
               <w:tc>
                 <w:tcPr>

</xml_diff>

<commit_message>
fix: fine tune operator table row height
</commit_message>
<xml_diff>
--- a/app/static/report-templates/daily-report-template.docx
+++ b/app/static/report-templates/daily-report-template.docx
@@ -2671,7 +2671,7 @@
             </w:tr>
             <w:tr>
               <w:trPr>
-                <w:trHeight w:val="440" w:hRule="exact"/>
+                <w:trHeight w:val="442" w:hRule="exact"/>
               </w:trPr>
               <w:tc>
                 <w:tcPr>
@@ -2899,7 +2899,7 @@
             </w:tr>
             <w:tr>
               <w:trPr>
-                <w:trHeight w:val="440" w:hRule="exact"/>
+                <w:trHeight w:val="442" w:hRule="exact"/>
               </w:trPr>
               <w:tc>
                 <w:tcPr>
@@ -3087,7 +3087,7 @@
             </w:tr>
             <w:tr>
               <w:trPr>
-                <w:trHeight w:val="440" w:hRule="exact"/>
+                <w:trHeight w:val="442" w:hRule="exact"/>
               </w:trPr>
               <w:tc>
                 <w:tcPr>
@@ -3289,7 +3289,7 @@
             </w:tr>
             <w:tr>
               <w:trPr>
-                <w:trHeight w:val="440" w:hRule="exact"/>
+                <w:trHeight w:val="442" w:hRule="exact"/>
               </w:trPr>
               <w:tc>
                 <w:tcPr>

</xml_diff>

<commit_message>
fix: allow operator responsibility rows to grow
</commit_message>
<xml_diff>
--- a/app/static/report-templates/daily-report-template.docx
+++ b/app/static/report-templates/daily-report-template.docx
@@ -2671,7 +2671,7 @@
             </w:tr>
             <w:tr>
               <w:trPr>
-                <w:trHeight w:val="442" w:hRule="exact"/>
+                <w:trHeight w:val="442" w:hRule="atLeast"/>
               </w:trPr>
               <w:tc>
                 <w:tcPr>
@@ -2899,7 +2899,7 @@
             </w:tr>
             <w:tr>
               <w:trPr>
-                <w:trHeight w:val="442" w:hRule="exact"/>
+                <w:trHeight w:val="442" w:hRule="atLeast"/>
               </w:trPr>
               <w:tc>
                 <w:tcPr>
@@ -3087,7 +3087,7 @@
             </w:tr>
             <w:tr>
               <w:trPr>
-                <w:trHeight w:val="442" w:hRule="exact"/>
+                <w:trHeight w:val="442" w:hRule="atLeast"/>
               </w:trPr>
               <w:tc>
                 <w:tcPr>
@@ -3289,7 +3289,7 @@
             </w:tr>
             <w:tr>
               <w:trPr>
-                <w:trHeight w:val="442" w:hRule="exact"/>
+                <w:trHeight w:val="442" w:hRule="atLeast"/>
               </w:trPr>
               <w:tc>
                 <w:tcPr>

</xml_diff>

<commit_message>
fix: align Word banner and table geometry
</commit_message>
<xml_diff>
--- a/app/static/report-templates/daily-report-template.docx
+++ b/app/static/report-templates/daily-report-template.docx
@@ -4,7 +4,9 @@
   <w:body>
     <w:tbl>
       <w:tblPr>
-        <w:tblW w:w="0" w:type="auto"/>
+        <w:tblW w:w="9922" w:type="dxa"/>
+        <w:tblInd w:w="0" w:type="dxa"/>
+        <w:tblLayout w:type="fixed"/>
         <w:jc w:val="center"/>
         <w:tblCellMar>
           <w:left w:w="0" w:type="dxa"/>
@@ -13,7 +15,7 @@
         <w:tblLook w:val="04A0" w:firstRow="1" w:lastRow="0" w:firstColumn="1" w:lastColumn="0" w:noHBand="0" w:noVBand="1"/>
       </w:tblPr>
       <w:tblGrid>
-        <w:gridCol w:w="10446"/>
+        <w:gridCol w:w="9922"/>
       </w:tblGrid>
       <w:tr>
         <w:trPr>
@@ -22,7 +24,7 @@
         </w:trPr>
         <w:tc>
           <w:tcPr>
-            <w:tcW w:w="9726" w:type="dxa"/>
+            <w:tcW w:w="9922" w:type="dxa"/>
             <w:tcBorders>
               <w:top w:val="single" w:sz="8" w:space="0" w:color="B4C6E7"/>
               <w:left w:val="single" w:sz="8" w:space="0" w:color="B4C6E7"/>
@@ -71,7 +73,7 @@
                   <wp:positionV relativeFrom="paragraph">
                     <wp:posOffset>0</wp:posOffset>
                   </wp:positionV>
-                  <wp:extent cx="6633210" cy="1116098"/>
+                  <wp:extent cx="6300470" cy="1060112"/>
                   <wp:effectExtent l="0" t="0" r="0" b="0"/>
                   <wp:wrapNone/>
                   <wp:docPr id="23" name="图片 23"/>
@@ -102,7 +104,7 @@
                         <pic:spPr>
                           <a:xfrm>
                             <a:off x="0" y="0"/>
-                            <a:ext cx="6633210" cy="1116098"/>
+                            <a:ext cx="6300470" cy="1060112"/>
                           </a:xfrm>
                           <a:prstGeom prst="rect">
                             <a:avLst/>
@@ -130,7 +132,7 @@
         </w:trPr>
         <w:tc>
           <w:tcPr>
-            <w:tcW w:w="9726" w:type="dxa"/>
+            <w:tcW w:w="9922" w:type="dxa"/>
             <w:tcBorders>
               <w:top w:val="nil"/>
               <w:left w:val="single" w:sz="8" w:space="0" w:color="B4C6E7"/>
@@ -180,7 +182,7 @@
         </w:trPr>
         <w:tc>
           <w:tcPr>
-            <w:tcW w:w="9726" w:type="dxa"/>
+            <w:tcW w:w="9922" w:type="dxa"/>
             <w:tcBorders>
               <w:top w:val="nil"/>
               <w:left w:val="single" w:sz="8" w:space="0" w:color="B4C6E7"/>
@@ -570,7 +572,7 @@
         </w:trPr>
         <w:tc>
           <w:tcPr>
-            <w:tcW w:w="9726" w:type="dxa"/>
+            <w:tcW w:w="9922" w:type="dxa"/>
             <w:tcBorders>
               <w:top w:val="nil"/>
               <w:left w:val="single" w:sz="8" w:space="0" w:color="B4C6E7"/>
@@ -733,7 +735,7 @@
         </w:trPr>
         <w:tc>
           <w:tcPr>
-            <w:tcW w:w="9726" w:type="dxa"/>
+            <w:tcW w:w="9922" w:type="dxa"/>
             <w:tcBorders>
               <w:top w:val="nil"/>
               <w:left w:val="single" w:sz="8" w:space="0" w:color="B4C6E7"/>
@@ -2129,7 +2131,7 @@
         </w:trPr>
         <w:tc>
           <w:tcPr>
-            <w:tcW w:w="9726" w:type="dxa"/>
+            <w:tcW w:w="9922" w:type="dxa"/>
             <w:tcBorders>
               <w:top w:val="nil"/>
               <w:left w:val="single" w:sz="8" w:space="0" w:color="B4C6E7"/>
@@ -2195,7 +2197,7 @@
         </w:trPr>
         <w:tc>
           <w:tcPr>
-            <w:tcW w:w="9726" w:type="dxa"/>
+            <w:tcW w:w="9922" w:type="dxa"/>
             <w:tcBorders>
               <w:top w:val="nil"/>
               <w:left w:val="single" w:sz="8" w:space="0" w:color="B4C6E7"/>
@@ -2244,7 +2246,7 @@
         </w:trPr>
         <w:tc>
           <w:tcPr>
-            <w:tcW w:w="9726" w:type="dxa"/>
+            <w:tcW w:w="9922" w:type="dxa"/>
             <w:tcBorders>
               <w:top w:val="nil"/>
               <w:left w:val="single" w:sz="8" w:space="0" w:color="B4C6E7"/>
@@ -2309,7 +2311,7 @@
         </w:trPr>
         <w:tc>
           <w:tcPr>
-            <w:tcW w:w="9726" w:type="dxa"/>
+            <w:tcW w:w="9922" w:type="dxa"/>
             <w:tcBorders>
               <w:top w:val="nil"/>
               <w:left w:val="single" w:sz="8" w:space="0" w:color="B4C6E7"/>
@@ -2358,7 +2360,7 @@
         </w:trPr>
         <w:tc>
           <w:tcPr>
-            <w:tcW w:w="9726" w:type="dxa"/>
+            <w:tcW w:w="9922" w:type="dxa"/>
             <w:tcBorders>
               <w:top w:val="nil"/>
               <w:left w:val="single" w:sz="8" w:space="0" w:color="B4C6E7"/>
@@ -2409,7 +2411,7 @@
         </w:trPr>
         <w:tc>
           <w:tcPr>
-            <w:tcW w:w="9726" w:type="dxa"/>
+            <w:tcW w:w="9922" w:type="dxa"/>
             <w:tcBorders>
               <w:top w:val="nil"/>
               <w:left w:val="single" w:sz="8" w:space="0" w:color="B4C6E7"/>
@@ -3513,7 +3515,7 @@
         </w:trPr>
         <w:tc>
           <w:tcPr>
-            <w:tcW w:w="9726" w:type="dxa"/>
+            <w:tcW w:w="9922" w:type="dxa"/>
             <w:tcBorders>
               <w:top w:val="nil"/>
               <w:left w:val="single" w:sz="8" w:space="0" w:color="5B9BD5"/>

</xml_diff>